<commit_message>
Update project to RPN tracking version
</commit_message>
<xml_diff>
--- a/2026嵌入式大赛应用赛道作品.docx
+++ b/2026嵌入式大赛应用赛道作品.docx
@@ -54,8 +54,6 @@
         </w:rPr>
         <w:t>摘要</w:t>
       </w:r>
-      <w:bookmarkStart w:id="17" w:name="_GoBack"/>
-      <w:bookmarkEnd w:id="17"/>
     </w:p>
     <w:p>
       <w:pPr>
@@ -77,7 +75,45 @@
           <w:sz w:val="24"/>
           <w:szCs w:val="24"/>
         </w:rPr>
-        <w:t>本作品面向水面、湿滑路面及高反光目标造成的过曝、纹理缺失和跟踪漂移问题，设计了一套无人机自适应偏振成像与视觉追踪系统。系统以地瓜派 RDK X5 为系统主控，统一完成相机采集、偏振角寻优、图像质量评价、目标检测与跟踪、状态协调、视频存储和 RTSP 推流；STM32作为下位实时执行控制器，仅负责偏振镜电机驱动、角度执行与反馈。该分工既发挥 RDK X5 的边缘计算与 AI 推理能力，又保证运动控制链路的实时性。系统首先在 0°-180° 范围内按设定步长扫描偏振角，对全图及目标 ROI 实时计算亮度、对比度、色彩、细节和眩光抑制得分；扫描序列同时构造无需人工标注的质量排序伪标签，以时序一致性约束在线校准轻量评分头。进入跟踪后，ByteTrack 基于目标检测框的高低置信度分层关联</w:t>
+        <w:t>本作品面向水面、湿滑路面及高反光目标造成的过曝、纹理缺失和跟踪漂移问题，设计了一套无人机自适应偏振成像与视觉追踪系统。系统以地瓜派 RDK X5 为系统主控，统一完成相机采集、偏振角寻优、图像质量评价、目标检测与跟踪、状态协调、视频存储和 RTSP 推流；STM32作为下位实时执行控制器，仅负责偏振镜电机驱动、角度执行与反馈。该分工既发挥 RDK X5 的边缘计算与 AI 推理能力，又保证运动控制链路的实时性。系统首先在 0°-180° 范围内按设定步长扫描偏振角，对全图及目标 ROI 实时计算亮度、对比度、色彩、细节和眩光抑制得分；扫描序列同时构造无需人工标注的质量排序伪标签，以时序一致性约束在线校准轻量评分头。进入跟踪后，SiamRPN 基于孪生特征提取网络和区域候选网络生成目标候选框，通过分类分支判断目标/背景并由回归分支细化目标位置</w:t>
+      </w:r>
+      <w:r>
+        <w:rPr>
+          <w:rFonts w:hint="default" w:ascii="Times New Roman" w:hAnsi="Times New Roman" w:eastAsia="宋体" w:cs="Times New Roman"/>
+          <w:color w:val="24313B"/>
+          <w:sz w:val="24"/>
+          <w:szCs w:val="24"/>
+          <w:vertAlign w:val="superscript"/>
+        </w:rPr>
+        <w:t>[12]</w:t>
+      </w:r>
+      <w:r>
+        <w:rPr>
+          <w:rFonts w:hint="default" w:ascii="Times New Roman" w:hAnsi="Times New Roman" w:eastAsia="宋体" w:cs="Times New Roman"/>
+          <w:color w:val="24313B"/>
+          <w:sz w:val="24"/>
+          <w:szCs w:val="24"/>
+        </w:rPr>
+        <w:t>；运动约束门控剔除不满足速度、加速度及尺度变化约束的候选框，跟踪误差进一步转换为云台或飞控伺服指令。系统结合 Brewster 角几何先验生成观测姿态和偏振方位参考，再以 ROI 质量反馈进行小范围修正，形成“成像优化—目标跟踪—姿态控制—新一帧反馈”的机载闭环</w:t>
+      </w:r>
+      <w:r>
+        <w:rPr>
+          <w:rFonts w:hint="default" w:ascii="Times New Roman" w:hAnsi="Times New Roman" w:eastAsia="宋体" w:cs="Times New Roman"/>
+          <w:color w:val="24313B"/>
+          <w:sz w:val="24"/>
+          <w:szCs w:val="24"/>
+          <w:vertAlign w:val="superscript"/>
+        </w:rPr>
+        <w:t>[1]</w:t>
+      </w:r>
+      <w:r>
+        <w:rPr>
+          <w:rFonts w:hint="default" w:ascii="Times New Roman" w:hAnsi="Times New Roman" w:eastAsia="宋体" w:cs="Times New Roman"/>
+          <w:color w:val="24313B"/>
+          <w:sz w:val="24"/>
+          <w:szCs w:val="24"/>
+        </w:rPr>
+        <w:t>。</w:t>
       </w:r>
       <w:r>
         <w:rPr>
@@ -120,7 +156,7 @@
           <w:vertAlign w:val="superscript"/>
           <w:lang w:val="en-US"/>
         </w:rPr>
-        <w:t>[17]</w:t>
+        <w:fldChar w:fldCharType="end"/>
       </w:r>
       <w:r>
         <w:rPr>
@@ -131,79 +167,39 @@
           <w:vertAlign w:val="superscript"/>
           <w:lang w:val="en-US"/>
         </w:rPr>
+        <w:fldChar w:fldCharType="begin"/>
+      </w:r>
+      <w:r>
+        <w:rPr>
+          <w:rFonts w:hint="default" w:ascii="Times New Roman" w:hAnsi="Times New Roman" w:eastAsia="宋体" w:cs="Times New Roman"/>
+          <w:color w:val="24313B"/>
+          <w:sz w:val="24"/>
+          <w:szCs w:val="24"/>
+          <w:vertAlign w:val="superscript"/>
+        </w:rPr>
+        <w:instrText xml:space="preserve"> REF _Ref15704 \r \h  \* MERGEFORMAT</w:instrText>
+      </w:r>
+      <w:r>
+        <w:rPr>
+          <w:rFonts w:hint="default" w:ascii="Times New Roman" w:hAnsi="Times New Roman" w:eastAsia="宋体" w:cs="Times New Roman"/>
+          <w:color w:val="24313B"/>
+          <w:sz w:val="24"/>
+          <w:szCs w:val="24"/>
+          <w:vertAlign w:val="superscript"/>
+          <w:lang w:val="en-US"/>
+        </w:rPr>
+        <w:fldChar w:fldCharType="separate"/>
+      </w:r>
+      <w:r>
+        <w:rPr>
+          <w:rFonts w:hint="default" w:ascii="Times New Roman" w:hAnsi="Times New Roman" w:eastAsia="宋体" w:cs="Times New Roman"/>
+          <w:color w:val="24313B"/>
+          <w:sz w:val="24"/>
+          <w:szCs w:val="24"/>
+          <w:vertAlign w:val="superscript"/>
+          <w:lang w:val="en-US"/>
+        </w:rPr>
         <w:fldChar w:fldCharType="end"/>
-      </w:r>
-      <w:r>
-        <w:rPr>
-          <w:rFonts w:hint="default" w:ascii="Times New Roman" w:hAnsi="Times New Roman" w:eastAsia="宋体" w:cs="Times New Roman"/>
-          <w:color w:val="24313B"/>
-          <w:sz w:val="24"/>
-          <w:szCs w:val="24"/>
-        </w:rPr>
-        <w:t>、Kalman 运动预测和匈牙利匹配持续维护目标轨迹，运动预测门控剔除不满足速度、加速度及尺度变化约束的候选框；跟踪误差进一步转换为云台或飞控伺服指令。系统结合 Brewster 角几何先验生成观测姿态和偏振方位参考，再以 ROI 质量反馈进行小范围修正，形成“成像优化—目标跟踪—姿态控制—新一帧反馈”的机载闭环</w:t>
-      </w:r>
-      <w:r>
-        <w:rPr>
-          <w:rFonts w:hint="default" w:ascii="Times New Roman" w:hAnsi="Times New Roman" w:eastAsia="宋体" w:cs="Times New Roman"/>
-          <w:color w:val="24313B"/>
-          <w:sz w:val="24"/>
-          <w:szCs w:val="24"/>
-          <w:vertAlign w:val="superscript"/>
-          <w:lang w:val="en-US"/>
-        </w:rPr>
-        <w:fldChar w:fldCharType="begin"/>
-      </w:r>
-      <w:r>
-        <w:rPr>
-          <w:rFonts w:hint="default" w:ascii="Times New Roman" w:hAnsi="Times New Roman" w:eastAsia="宋体" w:cs="Times New Roman"/>
-          <w:color w:val="24313B"/>
-          <w:sz w:val="24"/>
-          <w:szCs w:val="24"/>
-          <w:vertAlign w:val="superscript"/>
-        </w:rPr>
-        <w:instrText xml:space="preserve"> REF _Ref15704 \r \h  \* MERGEFORMAT</w:instrText>
-      </w:r>
-      <w:r>
-        <w:rPr>
-          <w:rFonts w:hint="default" w:ascii="Times New Roman" w:hAnsi="Times New Roman" w:eastAsia="宋体" w:cs="Times New Roman"/>
-          <w:color w:val="24313B"/>
-          <w:sz w:val="24"/>
-          <w:szCs w:val="24"/>
-          <w:vertAlign w:val="superscript"/>
-          <w:lang w:val="en-US"/>
-        </w:rPr>
-        <w:fldChar w:fldCharType="separate"/>
-      </w:r>
-      <w:r>
-        <w:rPr>
-          <w:rFonts w:hint="default" w:ascii="Times New Roman" w:hAnsi="Times New Roman" w:eastAsia="宋体" w:cs="Times New Roman"/>
-          <w:color w:val="24313B"/>
-          <w:sz w:val="24"/>
-          <w:szCs w:val="24"/>
-          <w:vertAlign w:val="superscript"/>
-          <w:lang w:val="en-US"/>
-        </w:rPr>
-        <w:t>[1]</w:t>
-      </w:r>
-      <w:r>
-        <w:rPr>
-          <w:rFonts w:hint="default" w:ascii="Times New Roman" w:hAnsi="Times New Roman" w:eastAsia="宋体" w:cs="Times New Roman"/>
-          <w:color w:val="24313B"/>
-          <w:sz w:val="24"/>
-          <w:szCs w:val="24"/>
-          <w:vertAlign w:val="superscript"/>
-          <w:lang w:val="en-US"/>
-        </w:rPr>
-        <w:fldChar w:fldCharType="end"/>
-      </w:r>
-      <w:r>
-        <w:rPr>
-          <w:rFonts w:hint="default" w:ascii="Times New Roman" w:hAnsi="Times New Roman" w:eastAsia="宋体" w:cs="Times New Roman"/>
-          <w:color w:val="24313B"/>
-          <w:sz w:val="24"/>
-          <w:szCs w:val="24"/>
-        </w:rPr>
-        <w:t>。</w:t>
       </w:r>
     </w:p>
     <w:p>
@@ -336,7 +332,7 @@
           <w:sz w:val="24"/>
           <w:szCs w:val="24"/>
         </w:rPr>
-        <w:t>本作品以地瓜派 RDK X5 为机载视觉计算与任务调度主控，以 STM32 为偏振执行机构和伺服接口的实时控制器，并与云台/飞控接口组成软硬件协同闭环。RDK X5 负责图像采集、实时质量评价、自监督偏振寻优、ByteTrack 跟踪、运动约束判别和控制量生成；STM32 负责偏振镜电机、角度反馈及底层执行保护。系统按“光学抑光—质量评价—目标跟踪—伺服控制—成像反馈”逐帧运行，使偏振角、目标状态和无人机观测姿态共同参与闭环决策。</w:t>
+        <w:t>本作品以地瓜派 RDK X5 为机载视觉计算与任务调度主控，以 STM32 为偏振执行机构和伺服接口的实时控制器，并与云台/飞控接口组成软硬件协同闭环。RDK X5 负责图像采集、实时质量评价、自监督偏振寻优、SiamRPN 跟踪、运动约束判别和控制量生成；STM32 负责偏振镜电机、角度反馈及底层执行保护。系统按“光学抑光—质量评价—目标跟踪—伺服控制—成像反馈”逐帧运行，使偏振角、目标状态和无人机观测姿态共同参与闭环决策。</w:t>
       </w:r>
     </w:p>
     <w:p>
@@ -359,7 +355,7 @@
           <w:sz w:val="24"/>
           <w:szCs w:val="24"/>
         </w:rPr>
-        <w:t>核心特性包括 0°-180° 偏振扫描、五维实时质量评价、自监督校准、运动约束 ByteTrack 跟踪、Brewster 角协同控制、失效重检测和多格式归档。物理层先抑制眩光并保留纹理，算法层完成目标定位与轨迹关联，伺服层再根据像面偏差调整观测方向。</w:t>
+        <w:t>核心特性包括 0°-180° 偏振扫描、五维实时质量评价、自监督校准、运动约束 SiamRPN 跟踪、Brewster 角协同控制、失效重检测和多格式归档。物理层先抑制眩光并保留纹理，算法层完成目标定位与连续跟踪，伺服层再根据像面偏差调整观测方向。</w:t>
       </w:r>
     </w:p>
     <w:p>
@@ -774,7 +770,7 @@
           <w:sz w:val="24"/>
           <w:szCs w:val="24"/>
         </w:rPr>
-        <w:t>（3）运动约束 ByteTrack 跟踪。检测模块输出目标框后，跟踪模块结合速度、加速度、尺度变化和图像边界等约束抑制漂移，并在低置信或短时遮挡情况下触发重检测，提高强反光环境下的目标连续跟踪能力。</w:t>
+        <w:t>（3）运动约束 SiamRPN 跟踪。目标初始化后，跟踪模块通过模板分支与搜索分支匹配生成候选框，并结合速度、加速度、尺度变化和图像边界等约束抑制漂移；在低置信或短时遮挡情况下触发重检测，提高强反光环境下的目标连续跟踪能力。</w:t>
       </w:r>
     </w:p>
     <w:p>
@@ -906,7 +902,7 @@
           <w:sz w:val="24"/>
           <w:szCs w:val="24"/>
         </w:rPr>
-        <w:t>（3）运动约束 ByteTrack 跟踪。检测模块输出目标框后，跟踪模块结合速度、加速度、尺度变化和图像边界等约束抑制漂移，并在低置信或短时遮挡情况下触发重检测，提高强反光环境下的目标连续跟踪能力。</w:t>
+        <w:t>（3）运动约束 SiamRPN 跟踪。目标初始化后，跟踪模块通过模板分支与搜索分支匹配生成候选框，并结合速度、加速度、尺度变化和图像边界等约束抑制漂移；在低置信或短时遮挡情况下触发重检测，提高强反光环境下的目标连续跟踪能力。</w:t>
       </w:r>
     </w:p>
     <w:p>
@@ -1102,7 +1098,7 @@
                 <w:rFonts w:hint="default" w:ascii="Times New Roman" w:hAnsi="Times New Roman" w:cs="Times New Roman"/>
                 <w:vertAlign w:val="baseline"/>
               </w:rPr>
-              <w:t>ByteTrack每帧运行</w:t>
+              <w:t>SiamRPN每帧运行</w:t>
             </w:r>
           </w:p>
         </w:tc>
@@ -1195,7 +1191,7 @@
                 <w:rFonts w:hint="default" w:ascii="Times New Roman" w:hAnsi="Times New Roman" w:cs="Times New Roman"/>
                 <w:vertAlign w:val="baseline"/>
               </w:rPr>
-              <w:t>track_buffer=60帧，短暂遮挡后自动重连</w:t>
+              <w:t>低置信保持与重检测机制，短暂遮挡后重新锁定</w:t>
             </w:r>
           </w:p>
         </w:tc>
@@ -1237,7 +1233,7 @@
                 <w:rFonts w:hint="default" w:ascii="Times New Roman" w:hAnsi="Times New Roman" w:cs="Times New Roman"/>
                 <w:vertAlign w:val="baseline"/>
               </w:rPr>
-              <w:t>跟踪匹配阈值</w:t>
+              <w:t>候选框置信阈值</w:t>
             </w:r>
           </w:p>
         </w:tc>
@@ -1258,7 +1254,7 @@
                 <w:rFonts w:hint="default" w:ascii="Times New Roman" w:hAnsi="Times New Roman" w:cs="Times New Roman"/>
                 <w:vertAlign w:val="baseline"/>
               </w:rPr>
-              <w:t>loU≥0.5</w:t>
+              <w:t>Score≥0.5</w:t>
             </w:r>
           </w:p>
         </w:tc>
@@ -1706,7 +1702,7 @@
                 <w:vertAlign w:val="baseline"/>
                 <w:lang w:val="en-US" w:eastAsia="zh-CN"/>
               </w:rPr>
-              <w:t>本系统(偏振+ByteTrack)</w:t>
+              <w:t>本系统(偏振+SiamRPN)</w:t>
             </w:r>
           </w:p>
         </w:tc>
@@ -2021,7 +2017,7 @@
                 <w:vertAlign w:val="baseline"/>
                 <w:lang w:val="en-US" w:eastAsia="zh-CN"/>
               </w:rPr>
-              <w:t>卡尔曼预测+loU匹配，抗丢帧</w:t>
+              <w:t>模板匹配+RPN候选框回归，抗干扰</w:t>
             </w:r>
           </w:p>
         </w:tc>
@@ -2087,6 +2083,44 @@
           <w:sz w:val="24"/>
           <w:szCs w:val="24"/>
           <w:vertAlign w:val="superscript"/>
+        </w:rPr>
+        <w:t>[7]</w:t>
+      </w:r>
+      <w:r>
+        <w:rPr>
+          <w:rFonts w:hint="default" w:ascii="Times New Roman" w:hAnsi="Times New Roman" w:eastAsia="宋体" w:cs="Times New Roman"/>
+          <w:color w:val="24313B"/>
+          <w:sz w:val="24"/>
+          <w:szCs w:val="24"/>
+        </w:rPr>
+        <w:t>。（2）运动约束 SiamRPN 联合目标模板、候选框置信度、尺度变化、速度和边界条件抑制漂移，并输出云台/飞控控制量。（3）Brewster 角先验协调观测姿态与偏振镜方位</w:t>
+      </w:r>
+      <w:r>
+        <w:rPr>
+          <w:rFonts w:hint="default" w:ascii="Times New Roman" w:hAnsi="Times New Roman" w:eastAsia="宋体" w:cs="Times New Roman"/>
+          <w:color w:val="24313B"/>
+          <w:sz w:val="24"/>
+          <w:szCs w:val="24"/>
+          <w:vertAlign w:val="superscript"/>
+        </w:rPr>
+        <w:t>[15]</w:t>
+      </w:r>
+      <w:r>
+        <w:rPr>
+          <w:rFonts w:hint="default" w:ascii="Times New Roman" w:hAnsi="Times New Roman" w:eastAsia="宋体" w:cs="Times New Roman"/>
+          <w:color w:val="24313B"/>
+          <w:sz w:val="24"/>
+          <w:szCs w:val="24"/>
+        </w:rPr>
+        <w:t>。（4）RDK X5、STM32、相机、偏振机构和云台/飞控构成无人机机载软硬件闭环。</w:t>
+      </w:r>
+      <w:r>
+        <w:rPr>
+          <w:rFonts w:hint="default" w:ascii="Times New Roman" w:hAnsi="Times New Roman" w:eastAsia="宋体" w:cs="Times New Roman"/>
+          <w:color w:val="24313B"/>
+          <w:sz w:val="24"/>
+          <w:szCs w:val="24"/>
+          <w:vertAlign w:val="superscript"/>
           <w:lang w:val="en-US"/>
         </w:rPr>
         <w:fldChar w:fldCharType="begin"/>
@@ -2121,7 +2155,7 @@
           <w:vertAlign w:val="superscript"/>
           <w:lang w:val="en-US"/>
         </w:rPr>
-        <w:t>[7]</w:t>
+        <w:fldChar w:fldCharType="end"/>
       </w:r>
       <w:r>
         <w:rPr>
@@ -2132,79 +2166,39 @@
           <w:vertAlign w:val="superscript"/>
           <w:lang w:val="en-US"/>
         </w:rPr>
+        <w:fldChar w:fldCharType="begin"/>
+      </w:r>
+      <w:r>
+        <w:rPr>
+          <w:rFonts w:hint="default" w:ascii="Times New Roman" w:hAnsi="Times New Roman" w:eastAsia="宋体" w:cs="Times New Roman"/>
+          <w:color w:val="24313B"/>
+          <w:sz w:val="24"/>
+          <w:szCs w:val="24"/>
+          <w:vertAlign w:val="superscript"/>
+        </w:rPr>
+        <w:instrText xml:space="preserve"> REF _Ref18414 \r \h  \* MERGEFORMAT</w:instrText>
+      </w:r>
+      <w:r>
+        <w:rPr>
+          <w:rFonts w:hint="default" w:ascii="Times New Roman" w:hAnsi="Times New Roman" w:eastAsia="宋体" w:cs="Times New Roman"/>
+          <w:color w:val="24313B"/>
+          <w:sz w:val="24"/>
+          <w:szCs w:val="24"/>
+          <w:vertAlign w:val="superscript"/>
+          <w:lang w:val="en-US"/>
+        </w:rPr>
+        <w:fldChar w:fldCharType="separate"/>
+      </w:r>
+      <w:r>
+        <w:rPr>
+          <w:rFonts w:hint="default" w:ascii="Times New Roman" w:hAnsi="Times New Roman" w:eastAsia="宋体" w:cs="Times New Roman"/>
+          <w:color w:val="24313B"/>
+          <w:sz w:val="24"/>
+          <w:szCs w:val="24"/>
+          <w:vertAlign w:val="superscript"/>
+          <w:lang w:val="en-US"/>
+        </w:rPr>
         <w:fldChar w:fldCharType="end"/>
-      </w:r>
-      <w:r>
-        <w:rPr>
-          <w:rFonts w:hint="default" w:ascii="Times New Roman" w:hAnsi="Times New Roman" w:eastAsia="宋体" w:cs="Times New Roman"/>
-          <w:color w:val="24313B"/>
-          <w:sz w:val="24"/>
-          <w:szCs w:val="24"/>
-        </w:rPr>
-        <w:t>。（2）运动约束 ByteTrack 联合目标检测置信度、轨迹状态、速度、加速度、尺度和边界条件抑制漂移，并输出云台/飞控控制量。（3）Brewster 角先验协调观测姿态与偏振镜方位</w:t>
-      </w:r>
-      <w:r>
-        <w:rPr>
-          <w:rFonts w:hint="default" w:ascii="Times New Roman" w:hAnsi="Times New Roman" w:eastAsia="宋体" w:cs="Times New Roman"/>
-          <w:color w:val="24313B"/>
-          <w:sz w:val="24"/>
-          <w:szCs w:val="24"/>
-          <w:vertAlign w:val="superscript"/>
-          <w:lang w:val="en-US"/>
-        </w:rPr>
-        <w:fldChar w:fldCharType="begin"/>
-      </w:r>
-      <w:r>
-        <w:rPr>
-          <w:rFonts w:hint="default" w:ascii="Times New Roman" w:hAnsi="Times New Roman" w:eastAsia="宋体" w:cs="Times New Roman"/>
-          <w:color w:val="24313B"/>
-          <w:sz w:val="24"/>
-          <w:szCs w:val="24"/>
-          <w:vertAlign w:val="superscript"/>
-        </w:rPr>
-        <w:instrText xml:space="preserve"> REF _Ref18414 \r \h  \* MERGEFORMAT</w:instrText>
-      </w:r>
-      <w:r>
-        <w:rPr>
-          <w:rFonts w:hint="default" w:ascii="Times New Roman" w:hAnsi="Times New Roman" w:eastAsia="宋体" w:cs="Times New Roman"/>
-          <w:color w:val="24313B"/>
-          <w:sz w:val="24"/>
-          <w:szCs w:val="24"/>
-          <w:vertAlign w:val="superscript"/>
-          <w:lang w:val="en-US"/>
-        </w:rPr>
-        <w:fldChar w:fldCharType="separate"/>
-      </w:r>
-      <w:r>
-        <w:rPr>
-          <w:rFonts w:hint="default" w:ascii="Times New Roman" w:hAnsi="Times New Roman" w:eastAsia="宋体" w:cs="Times New Roman"/>
-          <w:color w:val="24313B"/>
-          <w:sz w:val="24"/>
-          <w:szCs w:val="24"/>
-          <w:vertAlign w:val="superscript"/>
-          <w:lang w:val="en-US"/>
-        </w:rPr>
-        <w:t>[15]</w:t>
-      </w:r>
-      <w:r>
-        <w:rPr>
-          <w:rFonts w:hint="default" w:ascii="Times New Roman" w:hAnsi="Times New Roman" w:eastAsia="宋体" w:cs="Times New Roman"/>
-          <w:color w:val="24313B"/>
-          <w:sz w:val="24"/>
-          <w:szCs w:val="24"/>
-          <w:vertAlign w:val="superscript"/>
-          <w:lang w:val="en-US"/>
-        </w:rPr>
-        <w:fldChar w:fldCharType="end"/>
-      </w:r>
-      <w:r>
-        <w:rPr>
-          <w:rFonts w:hint="default" w:ascii="Times New Roman" w:hAnsi="Times New Roman" w:eastAsia="宋体" w:cs="Times New Roman"/>
-          <w:color w:val="24313B"/>
-          <w:sz w:val="24"/>
-          <w:szCs w:val="24"/>
-        </w:rPr>
-        <w:t>。（4）RDK X5、STM32、相机、偏振机构和云台/飞控构成无人机机载软硬件闭环。</w:t>
       </w:r>
     </w:p>
     <w:p>
@@ -2242,7 +2236,7 @@
           <w:sz w:val="24"/>
           <w:szCs w:val="24"/>
         </w:rPr>
-        <w:t>系统设计从反光场景成像痛点出发，依次完成偏振成像装置、实时质量评价、自监督寻优、ByteTrack 跟踪、运动约束伺服和 Brewster 角控制的模块化设计。联调遵循“传感器标定—偏振粗扫—质量评分与伪标签生成—最优角回归—目标检测初始化—高低置信度关联—云台/飞控执行—闭环复核—数据归档”的流程；各模块共享时间戳、目标 ID、偏振角、姿态和置信度，保证机载端数据链一致。</w:t>
+        <w:t>系统设计从反光场景成像痛点出发，依次完成偏振成像装置、实时质量评价、自监督寻优、SiamRPN 跟踪、运动约束伺服和 Brewster 角控制的模块化设计。联调遵循“传感器标定—偏振粗扫—质量评分与伪标签生成—最优角回归—目标初始化—模板匹配与候选框回归—云台/飞控执行—闭环复核—数据归档”的流程；各模块共享时间戳、目标框、偏振角、姿态和置信度，保证机载端数据链一致。</w:t>
       </w:r>
     </w:p>
     <w:p>
@@ -2361,7 +2355,26 @@
           <w:sz w:val="24"/>
           <w:szCs w:val="24"/>
         </w:rPr>
-        <w:t>系统由自适应偏振成像装置、RDK X5 边缘计算、STM32 实时执行、运动约束 ByteTrack 跟踪、Brewster 角协同控制、云台/飞控接口和数据服务组成</w:t>
+        <w:t>系统由自适应偏振成像装置、RDK X5 边缘计算、STM32 实时执行、运动约束 SiamRPN 跟踪、Brewster 角协同控制、云台/飞控接口和数据服务组成</w:t>
+      </w:r>
+      <w:r>
+        <w:rPr>
+          <w:rFonts w:hint="default" w:ascii="Times New Roman" w:hAnsi="Times New Roman" w:eastAsia="宋体" w:cs="Times New Roman"/>
+          <w:color w:val="24313B"/>
+          <w:sz w:val="24"/>
+          <w:szCs w:val="24"/>
+          <w:vertAlign w:val="superscript"/>
+        </w:rPr>
+        <w:t>[16]</w:t>
+      </w:r>
+      <w:r>
+        <w:rPr>
+          <w:rFonts w:hint="default" w:ascii="Times New Roman" w:hAnsi="Times New Roman" w:eastAsia="宋体" w:cs="Times New Roman"/>
+          <w:color w:val="24313B"/>
+          <w:sz w:val="24"/>
+          <w:szCs w:val="24"/>
+        </w:rPr>
+        <w:t>。相机、线偏振镜及旋转机构形成光学前端；质量评价与自监督模块决定偏振状态；跟踪模块输出目标中心、尺度、目标框和置信度；伺服模块将像面误差与 Brewster 几何参考融合为姿态或角速度指令。所有模块由统一状态机调度。</w:t>
       </w:r>
       <w:r>
         <w:rPr>
@@ -2404,27 +2417,7 @@
           <w:vertAlign w:val="superscript"/>
           <w:lang w:val="en-US"/>
         </w:rPr>
-        <w:t>[16]</w:t>
-      </w:r>
-      <w:r>
-        <w:rPr>
-          <w:rFonts w:hint="default" w:ascii="Times New Roman" w:hAnsi="Times New Roman" w:eastAsia="宋体" w:cs="Times New Roman"/>
-          <w:color w:val="24313B"/>
-          <w:sz w:val="24"/>
-          <w:szCs w:val="24"/>
-          <w:vertAlign w:val="superscript"/>
-          <w:lang w:val="en-US"/>
-        </w:rPr>
         <w:fldChar w:fldCharType="end"/>
-      </w:r>
-      <w:r>
-        <w:rPr>
-          <w:rFonts w:hint="default" w:ascii="Times New Roman" w:hAnsi="Times New Roman" w:eastAsia="宋体" w:cs="Times New Roman"/>
-          <w:color w:val="24313B"/>
-          <w:sz w:val="24"/>
-          <w:szCs w:val="24"/>
-        </w:rPr>
-        <w:t>。相机、线偏振镜及旋转机构形成光学前端；质量评价与自监督模块决定偏振状态；跟踪模块输出目标中心、尺度、轨迹 ID 和置信度；伺服模块将像面误差与 Brewster 几何参考融合为姿态或角速度指令。所有模块由统一状态机调度。</w:t>
       </w:r>
     </w:p>
     <w:p>
@@ -2447,7 +2440,7 @@
           <w:sz w:val="24"/>
           <w:szCs w:val="24"/>
         </w:rPr>
-        <w:t>运行时，RDK X5 先执行偏振粗扫描，实时计算全图和目标 ROI 质量并生成排序伪标签，选出基准角后进入跟踪。ByteTrack 对检测器输出的高置信框和低置信框进行两阶段数据关联，运动模型预测下一帧可达区域并对候选框门控；置信度不足、运动突变或遮挡时保持轨迹预测并触发重检测。控制端根据目标像面偏差输出云台/飞控指令，同时依据 Brewster 角参考和质量反馈微调观测姿态与偏振角。下一帧再次评价跟踪置信度和 ROI 质量，闭合成像与伺服双环。</w:t>
+        <w:t>运行时，RDK X5 先执行偏振粗扫描，实时计算全图和目标 ROI 质量并生成排序伪标签，选出基准角后进入跟踪。SiamRPN 以上一帧目标模板和当前搜索区域为输入，生成目标候选框、分类置信度和尺度回归结果，运动模型再对候选框进行门控；置信度不足、运动突变或遮挡时保持上一有效状态并触发重检测。控制端根据目标像面偏差输出云台/飞控指令，同时依据 Brewster 角参考和质量反馈微调观测姿态与偏振角。下一帧再次评价跟踪置信度和 ROI 质量，闭合成像与伺服双环。</w:t>
       </w:r>
     </w:p>
     <w:p>
@@ -2783,7 +2776,7 @@
           <w:sz w:val="24"/>
           <w:szCs w:val="24"/>
         </w:rPr>
-        <w:t>软件系统以 RDK X5 端主程序为核心，采用分层、并发的模块化架构。硬件抽象层封装相机、串口、偏振电机和云台/飞控接口；基础服务层负责时间同步、消息队列、视频存储、数据导出与 RTSP 推流；算法层包含实时质量评价、自监督评分校准、目标检测、ByteTrack 数据关联、运动约束、遮挡判定和重检测；控制层包含 Brewster 角参考生成、像面误差伺服和安全限幅；应用层状态机管理待机、标定、寻优、跟踪、降级与存储状态。</w:t>
+        <w:t>软件系统以 RDK X5 端主程序为核心，采用分层、并发的模块化架构。硬件抽象层封装相机、串口、偏振电机和云台/飞控接口；基础服务层负责时间同步、消息队列、视频存储、数据导出与 RTSP 推流；算法层包含实时质量评价、自监督评分校准、SiamRPN 目标跟踪、候选框回归、运动约束、遮挡判定和重检测；控制层包含 Brewster 角参考生成、像面误差伺服和安全限幅；应用层状态机管理待机、标定、寻优、跟踪、降级与存储状态。</w:t>
       </w:r>
     </w:p>
     <w:p>
@@ -2806,7 +2799,7 @@
           <w:sz w:val="24"/>
           <w:szCs w:val="24"/>
         </w:rPr>
-        <w:t>系统启动后由 RDK X5 完成相机内参、偏振零位、云台中位和通信状态检查。偏振寻优阶段按 0°、10°直至 180°粗扫，计算综合质量并由自监督机制更新评分置信度，随后回归最优角并进行局部细扫。跟踪阶段初始化 ByteTrack 轨迹状态，以运动预测窗口限制检测框关联范围；控制阶段把归一化像面误差转换为带死区、速率上限和加速度上限的伺服指令，并结合 Brewster 角参考修正观测姿态。退出或故障时统一停车、回中、释放资源并保存完整日志。</w:t>
+        <w:t>系统启动后由 RDK X5 完成相机内参、偏振零位、云台中位和通信状态检查。偏振寻优阶段按 0°、10°直至 180°粗扫，计算综合质量并由自监督机制更新评分置信度，随后回归最优角并进行局部细扫。跟踪阶段初始化 SiamRPN 目标模板与搜索区域，以运动预测窗口限制候选框范围；控制阶段把归一化像面误差转换为带死区、速率上限和加速度上限的伺服指令，并结合 Brewster 角参考修正观测姿态。退出或故障时统一停车、回中、释放资源并保存完整日志。</w:t>
       </w:r>
     </w:p>
     <w:p>
@@ -3134,7 +3127,7 @@
         <w:rPr>
           <w:rFonts w:hint="default" w:ascii="Times New Roman" w:hAnsi="Times New Roman" w:cs="Times New Roman"/>
         </w:rPr>
-        <w:t>2.3.4 运动约束 ByteTrack 视觉跟踪伺服</w:t>
+        <w:t>2.3.4 运动约束 SiamRPN 视觉跟踪伺服</w:t>
       </w:r>
     </w:p>
     <w:p>
@@ -3157,7 +3150,45 @@
           <w:sz w:val="24"/>
           <w:szCs w:val="24"/>
         </w:rPr>
-        <w:t>ByteTrack 以目标检测器输出的边界框为输入，将高置信检测框优先与已有轨迹匹配，再利用低置信检测框补充遮挡、眩光和短时漏检场景下的关联</w:t>
+        <w:t>SiamRPN 以首帧或重检测得到的目标框为模板，在后续帧的搜索区域内提取孪生特征，并通过区域候选网络同时输出目标/背景分类得分和边界框回归结果</w:t>
+      </w:r>
+      <w:r>
+        <w:rPr>
+          <w:rFonts w:hint="default" w:ascii="Times New Roman" w:hAnsi="Times New Roman" w:eastAsia="宋体" w:cs="Times New Roman"/>
+          <w:color w:val="24313B"/>
+          <w:sz w:val="24"/>
+          <w:szCs w:val="24"/>
+          <w:vertAlign w:val="superscript"/>
+        </w:rPr>
+        <w:t>[11-12]</w:t>
+      </w:r>
+      <w:r>
+        <w:rPr>
+          <w:rFonts w:hint="default" w:ascii="Times New Roman" w:hAnsi="Times New Roman" w:eastAsia="宋体" w:cs="Times New Roman"/>
+          <w:color w:val="24313B"/>
+          <w:sz w:val="24"/>
+          <w:szCs w:val="24"/>
+        </w:rPr>
+        <w:t>。为适应无人机运动，系统维护目标中心、速度、尺度及其变化率，基于上一有效状态预测下一帧可达区域；候选框必须同时满足位置距离、速度、加速度、尺度变化和图像边界约束。最终得分由分类置信度、尺度一致性、位置偏差和运动约束加权构成，避免强眩光产生的相似高亮区域把跟踪框拉离真实目标</w:t>
+      </w:r>
+      <w:r>
+        <w:rPr>
+          <w:rFonts w:hint="default" w:ascii="Times New Roman" w:hAnsi="Times New Roman" w:eastAsia="宋体" w:cs="Times New Roman"/>
+          <w:color w:val="24313B"/>
+          <w:sz w:val="24"/>
+          <w:szCs w:val="24"/>
+          <w:vertAlign w:val="superscript"/>
+        </w:rPr>
+        <w:t>[3]</w:t>
+      </w:r>
+      <w:r>
+        <w:rPr>
+          <w:rFonts w:hint="default" w:ascii="Times New Roman" w:hAnsi="Times New Roman" w:eastAsia="宋体" w:cs="Times New Roman"/>
+          <w:color w:val="24313B"/>
+          <w:sz w:val="24"/>
+          <w:szCs w:val="24"/>
+        </w:rPr>
+        <w:t>。</w:t>
       </w:r>
       <w:r>
         <w:rPr>
@@ -3200,7 +3231,7 @@
           <w:vertAlign w:val="superscript"/>
           <w:lang w:val="en-US"/>
         </w:rPr>
-        <w:t>[11]</w:t>
+        <w:fldChar w:fldCharType="end"/>
       </w:r>
       <w:r>
         <w:rPr>
@@ -3211,6 +3242,38 @@
           <w:vertAlign w:val="superscript"/>
           <w:lang w:val="en-US"/>
         </w:rPr>
+        <w:fldChar w:fldCharType="begin"/>
+      </w:r>
+      <w:r>
+        <w:rPr>
+          <w:rFonts w:hint="default" w:ascii="Times New Roman" w:hAnsi="Times New Roman" w:eastAsia="宋体" w:cs="Times New Roman"/>
+          <w:color w:val="24313B"/>
+          <w:sz w:val="24"/>
+          <w:szCs w:val="24"/>
+          <w:vertAlign w:val="superscript"/>
+        </w:rPr>
+        <w:instrText xml:space="preserve"> REF _Ref18006 \r \h  \* MERGEFORMAT</w:instrText>
+      </w:r>
+      <w:r>
+        <w:rPr>
+          <w:rFonts w:hint="default" w:ascii="Times New Roman" w:hAnsi="Times New Roman" w:eastAsia="宋体" w:cs="Times New Roman"/>
+          <w:color w:val="24313B"/>
+          <w:sz w:val="24"/>
+          <w:szCs w:val="24"/>
+          <w:vertAlign w:val="superscript"/>
+          <w:lang w:val="en-US"/>
+        </w:rPr>
+        <w:fldChar w:fldCharType="separate"/>
+      </w:r>
+      <w:r>
+        <w:rPr>
+          <w:rFonts w:hint="default" w:ascii="Times New Roman" w:hAnsi="Times New Roman" w:eastAsia="宋体" w:cs="Times New Roman"/>
+          <w:color w:val="24313B"/>
+          <w:sz w:val="24"/>
+          <w:szCs w:val="24"/>
+          <w:vertAlign w:val="superscript"/>
+          <w:lang w:val="en-US"/>
+        </w:rPr>
         <w:fldChar w:fldCharType="end"/>
       </w:r>
       <w:r>
@@ -3219,29 +3282,13 @@
           <w:color w:val="24313B"/>
           <w:sz w:val="24"/>
           <w:szCs w:val="24"/>
-        </w:rPr>
-        <w:t>。为适应无人机运动，系统维护目标中心、速度、尺度及其变化率，基于 Kalman 预测得到下一帧可达区域</w:t>
-      </w:r>
-      <w:r>
-        <w:rPr>
-          <w:rFonts w:hint="default" w:ascii="Times New Roman" w:hAnsi="Times New Roman" w:eastAsia="宋体" w:cs="Times New Roman"/>
-          <w:color w:val="24313B"/>
-          <w:sz w:val="24"/>
-          <w:szCs w:val="24"/>
           <w:vertAlign w:val="superscript"/>
           <w:lang w:val="en-US"/>
         </w:rPr>
         <w:fldChar w:fldCharType="begin"/>
       </w:r>
       <w:r>
-        <w:rPr>
-          <w:rFonts w:hint="default" w:ascii="Times New Roman" w:hAnsi="Times New Roman" w:eastAsia="宋体" w:cs="Times New Roman"/>
-          <w:color w:val="24313B"/>
-          <w:sz w:val="24"/>
-          <w:szCs w:val="24"/>
-          <w:vertAlign w:val="superscript"/>
-        </w:rPr>
-        <w:instrText xml:space="preserve"> REF _Ref18006 \r \h  \* MERGEFORMAT</w:instrText>
+        <w:instrText xml:space="preserve"> REF _Ref16066 \r \h  \* MERGEFORMAT</w:instrText>
       </w:r>
       <w:r>
         <w:rPr>
@@ -3263,83 +3310,7 @@
           <w:vertAlign w:val="superscript"/>
           <w:lang w:val="en-US"/>
         </w:rPr>
-        <w:t>[12]</w:t>
-      </w:r>
-      <w:r>
-        <w:rPr>
-          <w:rFonts w:hint="default" w:ascii="Times New Roman" w:hAnsi="Times New Roman" w:eastAsia="宋体" w:cs="Times New Roman"/>
-          <w:color w:val="24313B"/>
-          <w:sz w:val="24"/>
-          <w:szCs w:val="24"/>
-          <w:vertAlign w:val="superscript"/>
-          <w:lang w:val="en-US"/>
-        </w:rPr>
         <w:fldChar w:fldCharType="end"/>
-      </w:r>
-      <w:r>
-        <w:rPr>
-          <w:rFonts w:hint="default" w:ascii="Times New Roman" w:hAnsi="Times New Roman" w:eastAsia="宋体" w:cs="Times New Roman"/>
-          <w:color w:val="24313B"/>
-          <w:sz w:val="24"/>
-          <w:szCs w:val="24"/>
-        </w:rPr>
-        <w:t>；候选框必须同时满足位置距离、速度、加速度、尺度变化和图像边界约束。最终代价由检测置信度、IoU 匹配和运动偏差加权构成，避免强眩光产生的相似高亮区域把跟踪框拉离真实目标</w:t>
-      </w:r>
-      <w:r>
-        <w:rPr>
-          <w:rFonts w:hint="default" w:ascii="Times New Roman" w:hAnsi="Times New Roman" w:eastAsia="宋体" w:cs="Times New Roman"/>
-          <w:color w:val="24313B"/>
-          <w:sz w:val="24"/>
-          <w:szCs w:val="24"/>
-          <w:vertAlign w:val="superscript"/>
-          <w:lang w:val="en-US"/>
-        </w:rPr>
-        <w:fldChar w:fldCharType="begin"/>
-      </w:r>
-      <w:r>
-        <w:instrText xml:space="preserve"> REF _Ref16066 \r \h  \* MERGEFORMAT</w:instrText>
-      </w:r>
-      <w:r>
-        <w:rPr>
-          <w:rFonts w:hint="default" w:ascii="Times New Roman" w:hAnsi="Times New Roman" w:eastAsia="宋体" w:cs="Times New Roman"/>
-          <w:color w:val="24313B"/>
-          <w:sz w:val="24"/>
-          <w:szCs w:val="24"/>
-          <w:vertAlign w:val="superscript"/>
-          <w:lang w:val="en-US"/>
-        </w:rPr>
-        <w:fldChar w:fldCharType="separate"/>
-      </w:r>
-      <w:r>
-        <w:rPr>
-          <w:rFonts w:hint="default" w:ascii="Times New Roman" w:hAnsi="Times New Roman" w:eastAsia="宋体" w:cs="Times New Roman"/>
-          <w:color w:val="24313B"/>
-          <w:sz w:val="24"/>
-          <w:szCs w:val="24"/>
-          <w:vertAlign w:val="superscript"/>
-          <w:lang w:val="en-US"/>
-        </w:rPr>
-        <w:t>[3]</w:t>
-      </w:r>
-      <w:r>
-        <w:rPr>
-          <w:rFonts w:hint="default" w:ascii="Times New Roman" w:hAnsi="Times New Roman" w:eastAsia="宋体" w:cs="Times New Roman"/>
-          <w:color w:val="24313B"/>
-          <w:sz w:val="24"/>
-          <w:szCs w:val="24"/>
-          <w:vertAlign w:val="superscript"/>
-          <w:lang w:val="en-US"/>
-        </w:rPr>
-        <w:fldChar w:fldCharType="end"/>
-      </w:r>
-      <w:r>
-        <w:rPr>
-          <w:rFonts w:hint="default" w:ascii="Times New Roman" w:hAnsi="Times New Roman" w:eastAsia="宋体" w:cs="Times New Roman"/>
-          <w:color w:val="24313B"/>
-          <w:sz w:val="24"/>
-          <w:szCs w:val="24"/>
-        </w:rPr>
-        <w:t>。</w:t>
       </w:r>
     </w:p>
     <w:p>
@@ -3475,7 +3446,7 @@
           <w:sz w:val="24"/>
           <w:szCs w:val="24"/>
         </w:rPr>
-        <w:t>控制采用外环与内环协同：外环在飞行安全、航迹和云台限位约束内，使观测方向尽量接近有利的入射几何；内环围绕参考偏振方位进行小范围搜索，以目标 ROI 眩光比例、质量得分和 ByteTrack 跟踪置信度作为反馈修正偏振角。当表面法向或介质未知时，系统降低几何先验权重，退化为安全的小步长质量寻优，保证控制不会依赖错误的 Brewster 估计。</w:t>
+        <w:t>控制采用外环与内环协同：外环在飞行安全、航迹和云台限位约束内，使观测方向尽量接近有利的入射几何；内环围绕参考偏振方位进行小范围搜索，以目标 ROI 眩光比例、质量得分和 SiamRPN 跟踪置信度作为反馈修正偏振角。当表面法向或介质未知时，系统降低几何先验权重，退化为安全的小步长质量寻优，保证控制不会依赖错误的 Brewster 估计。</w:t>
       </w:r>
     </w:p>
     <w:p>
@@ -3512,7 +3483,7 @@
           <w:sz w:val="24"/>
           <w:szCs w:val="24"/>
         </w:rPr>
-        <w:t>机载数据链按“相机帧→质量评价/自监督校准→目标检测与 ByteTrack 运动门控→目标像面误差→Brewster 参考融合→云台/飞控和偏振机构执行→下一帧复核”运行。RDK X5 处理计算密集型视觉任务并生成高层目标量；STM32 以固定控制周期完成电机驱动、角度反馈、限位、超时和故障保护；云台/飞控执行姿态命令。各消息携带统一时间戳和状态序号，过期命令不得进入执行队列。</w:t>
+        <w:t>机载数据链按“相机帧→质量评价/自监督校准→SiamRPN 候选框生成与运动门控→目标像面误差→Brewster 参考融合→云台/飞控和偏振机构执行→下一帧复核”运行。RDK X5 处理计算密集型视觉任务并生成高层目标量；STM32 以固定控制周期完成电机驱动、角度反馈、限位、超时和故障保护；云台/飞控执行姿态命令。各消息携带统一时间戳和状态序号，过期命令不得进入执行队列。</w:t>
       </w:r>
     </w:p>
     <w:p>
@@ -4498,7 +4469,47 @@
           <w:sz w:val="24"/>
           <w:szCs w:val="24"/>
         </w:rPr>
-        <w:t>系统按无人机机载软硬件协同架构持续完善：RDK X5 负责质量评价、自监督寻优、ByteTrack 跟踪和高层控制，STM32 负责偏振机构与伺服接口的确定性执行，云台/飞控负责姿态响应。后续重点补充三类工程验证：一是自监督评分在光照突变和新材质上的在线适应与防漂移测试；二是运动约束 ByteTrack 在高速飞行、遮挡和尺度突变下的成功率、中心误差及恢复时间</w:t>
+        <w:t>系统按无人机机载软硬件协同架构持续完善：RDK X5 负责质量评价、自监督寻优、SiamRPN 跟踪和高层控制，STM32 负责偏振机构与伺服接口的确定性执行，云台/飞控负责姿态响应。后续重点补充三类工程验证：一是自监督评分在光照突变和新材质上的在线适应与防漂移测试；二是运动约束 SiamRPN 在高速飞行、遮挡和尺度突变下的成功率、中心误差及恢复时间</w:t>
+      </w:r>
+      <w:r>
+        <w:rPr>
+          <w:rFonts w:hint="default" w:ascii="Times New Roman" w:hAnsi="Times New Roman" w:eastAsia="宋体" w:cs="Times New Roman"/>
+          <w:color w:val="24313B"/>
+          <w:sz w:val="24"/>
+          <w:szCs w:val="24"/>
+          <w:vertAlign w:val="superscript"/>
+        </w:rPr>
+        <w:t>[10]</w:t>
+      </w:r>
+      <w:r>
+        <w:rPr>
+          <w:rFonts w:hint="default" w:ascii="Times New Roman" w:hAnsi="Times New Roman" w:eastAsia="宋体" w:cs="Times New Roman"/>
+          <w:color w:val="24313B"/>
+          <w:sz w:val="24"/>
+          <w:szCs w:val="24"/>
+        </w:rPr>
+        <w:t>；三是 Brewster 几何参考在不同介质和入射角下对 ROI 眩光比例、跟踪 IoU、整机功耗、重量和时延的影响</w:t>
+      </w:r>
+      <w:bookmarkStart w:id="17" w:name="_GoBack"/>
+      <w:r>
+        <w:rPr>
+          <w:rFonts w:hint="default" w:ascii="Times New Roman" w:hAnsi="Times New Roman" w:eastAsia="宋体" w:cs="Times New Roman"/>
+          <w:color w:val="24313B"/>
+          <w:sz w:val="24"/>
+          <w:szCs w:val="24"/>
+          <w:vertAlign w:val="superscript"/>
+        </w:rPr>
+        <w:t>[14]</w:t>
+      </w:r>
+      <w:bookmarkEnd w:id="17"/>
+      <w:r>
+        <w:rPr>
+          <w:rFonts w:hint="default" w:ascii="Times New Roman" w:hAnsi="Times New Roman" w:eastAsia="宋体" w:cs="Times New Roman"/>
+          <w:color w:val="24313B"/>
+          <w:sz w:val="24"/>
+          <w:szCs w:val="24"/>
+        </w:rPr>
+        <w:t>。</w:t>
       </w:r>
       <w:r>
         <w:rPr>
@@ -4541,7 +4552,7 @@
           <w:vertAlign w:val="superscript"/>
           <w:lang w:val="en-US"/>
         </w:rPr>
-        <w:t>[10]</w:t>
+        <w:fldChar w:fldCharType="end"/>
       </w:r>
       <w:r>
         <w:rPr>
@@ -4552,79 +4563,39 @@
           <w:vertAlign w:val="superscript"/>
           <w:lang w:val="en-US"/>
         </w:rPr>
+        <w:fldChar w:fldCharType="begin"/>
+      </w:r>
+      <w:r>
+        <w:rPr>
+          <w:rFonts w:hint="default" w:ascii="Times New Roman" w:hAnsi="Times New Roman" w:eastAsia="宋体" w:cs="Times New Roman"/>
+          <w:color w:val="24313B"/>
+          <w:sz w:val="24"/>
+          <w:szCs w:val="24"/>
+          <w:vertAlign w:val="superscript"/>
+        </w:rPr>
+        <w:instrText xml:space="preserve"> REF _Ref18218 \r \h  \* MERGEFORMAT</w:instrText>
+      </w:r>
+      <w:r>
+        <w:rPr>
+          <w:rFonts w:hint="default" w:ascii="Times New Roman" w:hAnsi="Times New Roman" w:eastAsia="宋体" w:cs="Times New Roman"/>
+          <w:color w:val="24313B"/>
+          <w:sz w:val="24"/>
+          <w:szCs w:val="24"/>
+          <w:vertAlign w:val="superscript"/>
+          <w:lang w:val="en-US"/>
+        </w:rPr>
+        <w:fldChar w:fldCharType="separate"/>
+      </w:r>
+      <w:r>
+        <w:rPr>
+          <w:rFonts w:hint="default" w:ascii="Times New Roman" w:hAnsi="Times New Roman" w:eastAsia="宋体" w:cs="Times New Roman"/>
+          <w:color w:val="24313B"/>
+          <w:sz w:val="24"/>
+          <w:szCs w:val="24"/>
+          <w:vertAlign w:val="superscript"/>
+          <w:lang w:val="en-US"/>
+        </w:rPr>
         <w:fldChar w:fldCharType="end"/>
-      </w:r>
-      <w:r>
-        <w:rPr>
-          <w:rFonts w:hint="default" w:ascii="Times New Roman" w:hAnsi="Times New Roman" w:eastAsia="宋体" w:cs="Times New Roman"/>
-          <w:color w:val="24313B"/>
-          <w:sz w:val="24"/>
-          <w:szCs w:val="24"/>
-        </w:rPr>
-        <w:t>；三是 Brewster 几何参考在不同介质和入射角下对 ROI 眩光比例、跟踪 IoU、整机功耗、重量和时延的影响</w:t>
-      </w:r>
-      <w:r>
-        <w:rPr>
-          <w:rFonts w:hint="default" w:ascii="Times New Roman" w:hAnsi="Times New Roman" w:eastAsia="宋体" w:cs="Times New Roman"/>
-          <w:color w:val="24313B"/>
-          <w:sz w:val="24"/>
-          <w:szCs w:val="24"/>
-          <w:vertAlign w:val="superscript"/>
-          <w:lang w:val="en-US"/>
-        </w:rPr>
-        <w:fldChar w:fldCharType="begin"/>
-      </w:r>
-      <w:r>
-        <w:rPr>
-          <w:rFonts w:hint="default" w:ascii="Times New Roman" w:hAnsi="Times New Roman" w:eastAsia="宋体" w:cs="Times New Roman"/>
-          <w:color w:val="24313B"/>
-          <w:sz w:val="24"/>
-          <w:szCs w:val="24"/>
-          <w:vertAlign w:val="superscript"/>
-        </w:rPr>
-        <w:instrText xml:space="preserve"> REF _Ref18218 \r \h  \* MERGEFORMAT</w:instrText>
-      </w:r>
-      <w:r>
-        <w:rPr>
-          <w:rFonts w:hint="default" w:ascii="Times New Roman" w:hAnsi="Times New Roman" w:eastAsia="宋体" w:cs="Times New Roman"/>
-          <w:color w:val="24313B"/>
-          <w:sz w:val="24"/>
-          <w:szCs w:val="24"/>
-          <w:vertAlign w:val="superscript"/>
-          <w:lang w:val="en-US"/>
-        </w:rPr>
-        <w:fldChar w:fldCharType="separate"/>
-      </w:r>
-      <w:r>
-        <w:rPr>
-          <w:rFonts w:hint="default" w:ascii="Times New Roman" w:hAnsi="Times New Roman" w:eastAsia="宋体" w:cs="Times New Roman"/>
-          <w:color w:val="24313B"/>
-          <w:sz w:val="24"/>
-          <w:szCs w:val="24"/>
-          <w:vertAlign w:val="superscript"/>
-          <w:lang w:val="en-US"/>
-        </w:rPr>
-        <w:t>[14]</w:t>
-      </w:r>
-      <w:r>
-        <w:rPr>
-          <w:rFonts w:hint="default" w:ascii="Times New Roman" w:hAnsi="Times New Roman" w:eastAsia="宋体" w:cs="Times New Roman"/>
-          <w:color w:val="24313B"/>
-          <w:sz w:val="24"/>
-          <w:szCs w:val="24"/>
-          <w:vertAlign w:val="superscript"/>
-          <w:lang w:val="en-US"/>
-        </w:rPr>
-        <w:fldChar w:fldCharType="end"/>
-      </w:r>
-      <w:r>
-        <w:rPr>
-          <w:rFonts w:hint="default" w:ascii="Times New Roman" w:hAnsi="Times New Roman" w:eastAsia="宋体" w:cs="Times New Roman"/>
-          <w:color w:val="24313B"/>
-          <w:sz w:val="24"/>
-          <w:szCs w:val="24"/>
-        </w:rPr>
-        <w:t>。</w:t>
       </w:r>
     </w:p>
     <w:p>
@@ -5488,7 +5459,7 @@
           <w:szCs w:val="21"/>
           <w:shd w:val="clear" w:fill="FFFFFF"/>
         </w:rPr>
-        <w:t>Zhang Y, Sun P, Jiang Y, et al. bytetrack: multi-object tracking by associating every detection box [C]// Proceedings of the European Conference on Computer Vision (ECCV). Tel Aviv: Springer, 2022: 1-21.</w:t>
+        <w:t>Li B, Wu W, Wang Q, et al. SiamRPN++: Evolution of Siamese Visual Tracking with Very Deep Networks[C]// Proceedings of the IEEE/CVF Conference on Computer Vision and Pattern Recognition (CVPR). Long Beach: IEEE, 2019: 4282-4291.</w:t>
       </w:r>
       <w:bookmarkEnd w:id="16"/>
     </w:p>

</xml_diff>